<commit_message>
Update Week 4 predictive modeling deliverables
Add the Week 4 predictive modeling report, model evaluation metrics, visualizations, feature importance results, and project documentation.
</commit_message>
<xml_diff>
--- a/Week_4_Predictive_Modeling_Report.docx
+++ b/Week_4_Predictive_Modeling_Report.docx
@@ -25,10 +25,10 @@
     </w:p>
     <w:p>
       <w:pPr>
-        <w:pStyle w:val="Subtitle"/>
+        <w:jc w:val="center"/>
       </w:pPr>
       <w:r>
-        <w:t>Prepared using a simulated logistics dataset of 500 shipments.</w:t>
+        <w:t>Based on a simulated dataset of 500 shipment records.</w:t>
       </w:r>
     </w:p>
     <w:p>
@@ -41,7 +41,7 @@
     </w:p>
     <w:p>
       <w:r>
-        <w:t>This project investigates whether shipment distance, weight, volume, transport mode, and transportation cost can predict delivery time in hours. The dataset contains 500 shipment records and 8 columns. Two regression models—Linear Regression and Random Forest Regression—were trained and evaluated using an 80/20 train-test split and five-fold cross-validation. The model with the lower test MAE was Linear Regression. However, both models have weak test-set predictive performance (R² values close to or below zero), which means the available features do not explain delivery-time variation well in this simulated dataset. The most important finding is therefore a data limitation: stronger operational predictors and more representative data are needed before using the model for live dispatch decisions.</w:t>
+        <w:t>This project predicts delivery time in hours using distance, shipment weight, volume, transport mode, and transportation cost. The dataset has 500 rows and 8 columns, with 0 missing values and 0 duplicate rows. Three approaches were compared: a mean baseline, Linear Regression, and a Random Forest tuned using five-fold cross-validation on the training set. Based on training cross-validation MAE, the tuned Random Forest was selected for final consideration; however, on the held-out test set its MAE was 29.85 hours, while the mean baseline achieved 29.65 hours. This mismatch indicates that the models have limited predictive value and that further data collection is needed.</w:t>
       </w:r>
     </w:p>
     <w:p>
@@ -49,12 +49,12 @@
         <w:pStyle w:val="Heading1"/>
       </w:pPr>
       <w:r>
-        <w:t>2. Problem Definition and Objective</w:t>
+        <w:t>2. Problem Definition</w:t>
       </w:r>
     </w:p>
     <w:p>
       <w:r>
-        <w:t>Logistics teams need reliable estimates of delivery time to communicate expected arrival times, identify shipments that may need attention, and plan staff and transport capacity. The objective is to build and compare regression models that forecast Delivery_Time_hours, evaluate their errors on unseen records, and propose optimization actions that can be tested with additional operational data.</w:t>
+        <w:t>Logistics teams benefit from estimates of delivery duration for planning, customer communication, and exception monitoring. The objective is to build a reproducible regression workflow, compare models fairly, and identify practical next steps for better logistics decisions. The current dataset is simulated, so findings are methodological demonstrations rather than real-world claims.</w:t>
       </w:r>
     </w:p>
     <w:p>
@@ -62,12 +62,12 @@
         <w:pStyle w:val="Heading1"/>
       </w:pPr>
       <w:r>
-        <w:t>3. Dataset Description</w:t>
+        <w:t>3. Dataset and Variables</w:t>
       </w:r>
     </w:p>
     <w:p>
       <w:r>
-        <w:t>The CSV contains 500 simulated shipment records and eight columns. There are no missing values and no duplicate rows in the inspected file. Shipment_ID is an identifier and is excluded from the predictors. Delivery_Status is also excluded because it may be assigned after the delivery outcome and would risk target leakage.</w:t>
+        <w:t>The dataset contains 500 simulated shipment records. Shipment_ID is an identifier and is not used as a predictor. Delivery_Status is excluded from model inputs because it may reflect an outcome assigned after delivery and could cause target leakage. The target is Delivery_Time_hours.</w:t>
       </w:r>
     </w:p>
     <w:tbl>
@@ -78,24 +78,24 @@
         <w:tblLook w:firstColumn="1" w:firstRow="1" w:lastColumn="0" w:lastRow="0" w:noHBand="0" w:noVBand="1" w:val="04A0"/>
       </w:tblPr>
       <w:tblGrid>
-        <w:gridCol w:w="3312"/>
-        <w:gridCol w:w="3312"/>
-        <w:gridCol w:w="3312"/>
+        <w:gridCol w:w="3360"/>
+        <w:gridCol w:w="3360"/>
+        <w:gridCol w:w="3360"/>
       </w:tblGrid>
       <w:tr>
         <w:tc>
           <w:tcPr>
-            <w:tcW w:type="dxa" w:w="3312"/>
+            <w:tcW w:type="dxa" w:w="3360"/>
           </w:tcPr>
           <w:p>
             <w:r>
-              <w:t>Column</w:t>
+              <w:t>Variable</w:t>
             </w:r>
           </w:p>
         </w:tc>
         <w:tc>
           <w:tcPr>
-            <w:tcW w:type="dxa" w:w="3312"/>
+            <w:tcW w:type="dxa" w:w="3360"/>
           </w:tcPr>
           <w:p>
             <w:r>
@@ -105,11 +105,11 @@
         </w:tc>
         <w:tc>
           <w:tcPr>
-            <w:tcW w:type="dxa" w:w="3312"/>
+            <w:tcW w:type="dxa" w:w="3360"/>
           </w:tcPr>
           <w:p>
             <w:r>
-              <w:t>Use</w:t>
+              <w:t>Role</w:t>
             </w:r>
           </w:p>
         </w:tc>
@@ -117,43 +117,7 @@
       <w:tr>
         <w:tc>
           <w:tcPr>
-            <w:tcW w:type="dxa" w:w="3312"/>
-            <w:vAlign w:val="center"/>
-          </w:tcPr>
-          <w:p>
-            <w:r>
-              <w:t>Shipment_ID</w:t>
-            </w:r>
-          </w:p>
-        </w:tc>
-        <w:tc>
-          <w:tcPr>
-            <w:tcW w:type="dxa" w:w="3312"/>
-            <w:vAlign w:val="center"/>
-          </w:tcPr>
-          <w:p>
-            <w:r>
-              <w:t>Integer</w:t>
-            </w:r>
-          </w:p>
-        </w:tc>
-        <w:tc>
-          <w:tcPr>
-            <w:tcW w:type="dxa" w:w="3312"/>
-            <w:vAlign w:val="center"/>
-          </w:tcPr>
-          <w:p>
-            <w:r>
-              <w:t>Identifier; excluded from model</w:t>
-            </w:r>
-          </w:p>
-        </w:tc>
-      </w:tr>
-      <w:tr>
-        <w:tc>
-          <w:tcPr>
-            <w:tcW w:type="dxa" w:w="3312"/>
-            <w:vAlign w:val="center"/>
+            <w:tcW w:type="dxa" w:w="3360"/>
           </w:tcPr>
           <w:p>
             <w:r>
@@ -163,19 +127,17 @@
         </w:tc>
         <w:tc>
           <w:tcPr>
-            <w:tcW w:type="dxa" w:w="3312"/>
-            <w:vAlign w:val="center"/>
+            <w:tcW w:type="dxa" w:w="3360"/>
           </w:tcPr>
           <w:p>
             <w:r>
-              <w:t>Integer</w:t>
+              <w:t>Numeric</w:t>
             </w:r>
           </w:p>
         </w:tc>
         <w:tc>
           <w:tcPr>
-            <w:tcW w:type="dxa" w:w="3312"/>
-            <w:vAlign w:val="center"/>
+            <w:tcW w:type="dxa" w:w="3360"/>
           </w:tcPr>
           <w:p>
             <w:r>
@@ -187,8 +149,7 @@
       <w:tr>
         <w:tc>
           <w:tcPr>
-            <w:tcW w:type="dxa" w:w="3312"/>
-            <w:vAlign w:val="center"/>
+            <w:tcW w:type="dxa" w:w="3360"/>
           </w:tcPr>
           <w:p>
             <w:r>
@@ -198,19 +159,17 @@
         </w:tc>
         <w:tc>
           <w:tcPr>
-            <w:tcW w:type="dxa" w:w="3312"/>
-            <w:vAlign w:val="center"/>
+            <w:tcW w:type="dxa" w:w="3360"/>
           </w:tcPr>
           <w:p>
             <w:r>
-              <w:t>Integer</w:t>
+              <w:t>Numeric</w:t>
             </w:r>
           </w:p>
         </w:tc>
         <w:tc>
           <w:tcPr>
-            <w:tcW w:type="dxa" w:w="3312"/>
-            <w:vAlign w:val="center"/>
+            <w:tcW w:type="dxa" w:w="3360"/>
           </w:tcPr>
           <w:p>
             <w:r>
@@ -222,8 +181,7 @@
       <w:tr>
         <w:tc>
           <w:tcPr>
-            <w:tcW w:type="dxa" w:w="3312"/>
-            <w:vAlign w:val="center"/>
+            <w:tcW w:type="dxa" w:w="3360"/>
           </w:tcPr>
           <w:p>
             <w:r>
@@ -233,19 +191,17 @@
         </w:tc>
         <w:tc>
           <w:tcPr>
-            <w:tcW w:type="dxa" w:w="3312"/>
-            <w:vAlign w:val="center"/>
+            <w:tcW w:type="dxa" w:w="3360"/>
           </w:tcPr>
           <w:p>
             <w:r>
-              <w:t>Integer</w:t>
+              <w:t>Numeric</w:t>
             </w:r>
           </w:p>
         </w:tc>
         <w:tc>
           <w:tcPr>
-            <w:tcW w:type="dxa" w:w="3312"/>
-            <w:vAlign w:val="center"/>
+            <w:tcW w:type="dxa" w:w="3360"/>
           </w:tcPr>
           <w:p>
             <w:r>
@@ -257,8 +213,7 @@
       <w:tr>
         <w:tc>
           <w:tcPr>
-            <w:tcW w:type="dxa" w:w="3312"/>
-            <w:vAlign w:val="center"/>
+            <w:tcW w:type="dxa" w:w="3360"/>
           </w:tcPr>
           <w:p>
             <w:r>
@@ -268,19 +223,17 @@
         </w:tc>
         <w:tc>
           <w:tcPr>
-            <w:tcW w:type="dxa" w:w="3312"/>
-            <w:vAlign w:val="center"/>
+            <w:tcW w:type="dxa" w:w="3360"/>
           </w:tcPr>
           <w:p>
             <w:r>
-              <w:t>Category</w:t>
+              <w:t>Categorical</w:t>
             </w:r>
           </w:p>
         </w:tc>
         <w:tc>
           <w:tcPr>
-            <w:tcW w:type="dxa" w:w="3312"/>
-            <w:vAlign w:val="center"/>
+            <w:tcW w:type="dxa" w:w="3360"/>
           </w:tcPr>
           <w:p>
             <w:r>
@@ -292,8 +245,39 @@
       <w:tr>
         <w:tc>
           <w:tcPr>
-            <w:tcW w:type="dxa" w:w="3312"/>
-            <w:vAlign w:val="center"/>
+            <w:tcW w:type="dxa" w:w="3360"/>
+          </w:tcPr>
+          <w:p>
+            <w:r>
+              <w:t>Transportation_Cost</w:t>
+            </w:r>
+          </w:p>
+        </w:tc>
+        <w:tc>
+          <w:tcPr>
+            <w:tcW w:type="dxa" w:w="3360"/>
+          </w:tcPr>
+          <w:p>
+            <w:r>
+              <w:t>Numeric</w:t>
+            </w:r>
+          </w:p>
+        </w:tc>
+        <w:tc>
+          <w:tcPr>
+            <w:tcW w:type="dxa" w:w="3360"/>
+          </w:tcPr>
+          <w:p>
+            <w:r>
+              <w:t>Predictor if known at prediction time</w:t>
+            </w:r>
+          </w:p>
+        </w:tc>
+      </w:tr>
+      <w:tr>
+        <w:tc>
+          <w:tcPr>
+            <w:tcW w:type="dxa" w:w="3360"/>
           </w:tcPr>
           <w:p>
             <w:r>
@@ -303,23 +287,21 @@
         </w:tc>
         <w:tc>
           <w:tcPr>
-            <w:tcW w:type="dxa" w:w="3312"/>
-            <w:vAlign w:val="center"/>
+            <w:tcW w:type="dxa" w:w="3360"/>
           </w:tcPr>
           <w:p>
             <w:r>
-              <w:t>Integer</w:t>
+              <w:t>Numeric</w:t>
             </w:r>
           </w:p>
         </w:tc>
         <w:tc>
           <w:tcPr>
-            <w:tcW w:type="dxa" w:w="3312"/>
-            <w:vAlign w:val="center"/>
+            <w:tcW w:type="dxa" w:w="3360"/>
           </w:tcPr>
           <w:p>
             <w:r>
-              <w:t>Target variable</w:t>
+              <w:t>Target</w:t>
             </w:r>
           </w:p>
         </w:tc>
@@ -327,43 +309,7 @@
       <w:tr>
         <w:tc>
           <w:tcPr>
-            <w:tcW w:type="dxa" w:w="3312"/>
-            <w:vAlign w:val="center"/>
-          </w:tcPr>
-          <w:p>
-            <w:r>
-              <w:t>Transportation_Cost</w:t>
-            </w:r>
-          </w:p>
-        </w:tc>
-        <w:tc>
-          <w:tcPr>
-            <w:tcW w:type="dxa" w:w="3312"/>
-            <w:vAlign w:val="center"/>
-          </w:tcPr>
-          <w:p>
-            <w:r>
-              <w:t>Integer</w:t>
-            </w:r>
-          </w:p>
-        </w:tc>
-        <w:tc>
-          <w:tcPr>
-            <w:tcW w:type="dxa" w:w="3312"/>
-            <w:vAlign w:val="center"/>
-          </w:tcPr>
-          <w:p>
-            <w:r>
-              <w:t>Predictor, if known at prediction time</w:t>
-            </w:r>
-          </w:p>
-        </w:tc>
-      </w:tr>
-      <w:tr>
-        <w:tc>
-          <w:tcPr>
-            <w:tcW w:type="dxa" w:w="3312"/>
-            <w:vAlign w:val="center"/>
+            <w:tcW w:type="dxa" w:w="3360"/>
           </w:tcPr>
           <w:p>
             <w:r>
@@ -373,23 +319,53 @@
         </w:tc>
         <w:tc>
           <w:tcPr>
-            <w:tcW w:type="dxa" w:w="3312"/>
-            <w:vAlign w:val="center"/>
+            <w:tcW w:type="dxa" w:w="3360"/>
           </w:tcPr>
           <w:p>
             <w:r>
-              <w:t>Category</w:t>
+              <w:t>Categorical</w:t>
             </w:r>
           </w:p>
         </w:tc>
         <w:tc>
           <w:tcPr>
-            <w:tcW w:type="dxa" w:w="3312"/>
-            <w:vAlign w:val="center"/>
+            <w:tcW w:type="dxa" w:w="3360"/>
           </w:tcPr>
           <w:p>
             <w:r>
-              <w:t>Descriptive analysis only; excluded to avoid leakage</w:t>
+              <w:t>Descriptive only; excluded from model</w:t>
+            </w:r>
+          </w:p>
+        </w:tc>
+      </w:tr>
+      <w:tr>
+        <w:tc>
+          <w:tcPr>
+            <w:tcW w:type="dxa" w:w="3360"/>
+          </w:tcPr>
+          <w:p>
+            <w:r>
+              <w:t>Shipment_ID</w:t>
+            </w:r>
+          </w:p>
+        </w:tc>
+        <w:tc>
+          <w:tcPr>
+            <w:tcW w:type="dxa" w:w="3360"/>
+          </w:tcPr>
+          <w:p>
+            <w:r>
+              <w:t>Identifier</w:t>
+            </w:r>
+          </w:p>
+        </w:tc>
+        <w:tc>
+          <w:tcPr>
+            <w:tcW w:type="dxa" w:w="3360"/>
+          </w:tcPr>
+          <w:p>
+            <w:r>
+              <w:t>Excluded</w:t>
             </w:r>
           </w:p>
         </w:tc>
@@ -397,7 +373,7 @@
     </w:tbl>
     <w:p>
       <w:r>
-        <w:t>Transport mode counts: Road: 133, Rail: 130, Air: 129, Sea: 108. Delivery status counts: On Time: 372, Delayed: 128. The simulated data labels 25.6% of shipments as delayed. This percentage describes this dataset only and should not be treated as an estimate of real-world performance.</w:t>
+        <w:t>Transport mode counts: Road: 133, Rail: 130, Air: 129, Sea: 108. Delivery status counts: On Time: 372, Delayed: 128. The simulated delayed-shipment share is 25.6%. This is descriptive of this dataset only.</w:t>
       </w:r>
     </w:p>
     <w:p>
@@ -413,7 +389,7 @@
         <w:pStyle w:val="ListBullet"/>
       </w:pPr>
       <w:r>
-        <w:t>Loaded the CSV with pandas and checked shape, data types, missing values, and duplicate rows.</w:t>
+        <w:t>Inspected the dataset shape, missing values, and duplicate rows.</w:t>
       </w:r>
     </w:p>
     <w:p>
@@ -421,7 +397,7 @@
         <w:pStyle w:val="ListBullet"/>
       </w:pPr>
       <w:r>
-        <w:t>Used an 80% training set and a 20% hold-out test set with random_state=42 for reproducibility.</w:t>
+        <w:t>Used an 80/20 train-test split with random_state=42 for reproducibility.</w:t>
       </w:r>
     </w:p>
     <w:p>
@@ -429,7 +405,7 @@
         <w:pStyle w:val="ListBullet"/>
       </w:pPr>
       <w:r>
-        <w:t>Imputed numeric missing values with the median and categorical missing values with the most frequent category; this keeps the pipeline robust even if future data contains gaps.</w:t>
+        <w:t>Placed imputation, scaling, and one-hot encoding inside a scikit-learn pipeline to reduce preprocessing leakage.</w:t>
       </w:r>
     </w:p>
     <w:p>
@@ -437,7 +413,7 @@
         <w:pStyle w:val="ListBullet"/>
       </w:pPr>
       <w:r>
-        <w:t>Standardized numeric predictors for the Linear Regression pipeline.</w:t>
+        <w:t>Used median imputation and standard scaling for numeric inputs, and most-frequent imputation plus one-hot encoding for the categorical transport mode.</w:t>
       </w:r>
     </w:p>
     <w:p>
@@ -445,7 +421,28 @@
         <w:pStyle w:val="ListBullet"/>
       </w:pPr>
       <w:r>
-        <w:t>One-hot encoded Transport_Mode so the models can use categorical values.</w:t>
+        <w:t>Excluded the shipment identifier and the post-outcome delivery status from model inputs.</w:t>
+      </w:r>
+    </w:p>
+    <w:p>
+      <w:pPr>
+        <w:pStyle w:val="Heading1"/>
+      </w:pPr>
+      <w:r>
+        <w:t>5. Model Selection and Tuning</w:t>
+      </w:r>
+    </w:p>
+    <w:p>
+      <w:r>
+        <w:t>Mean Baseline: predicts the mean delivery time from the training set and provides a simple benchmark. Linear Regression: provides an interpretable linear baseline. Tuned Random Forest: can capture nonlinear patterns and interactions. GridSearchCV tested combinations of tree count, maximum depth, minimum samples per leaf, and maximum features using negative MAE as the selection score. Tuning was performed only on the training data.</w:t>
+      </w:r>
+    </w:p>
+    <w:p>
+      <w:pPr>
+        <w:pStyle w:val="Heading1"/>
+      </w:pPr>
+      <w:r>
+        <w:t>6. Evaluation Metrics and Validation</w:t>
       </w:r>
     </w:p>
     <w:p>
@@ -453,54 +450,7 @@
         <w:pStyle w:val="ListBullet"/>
       </w:pPr>
       <w:r>
-        <w:t>Excluded Shipment_ID because it is not a meaningful operational feature and excluded Delivery_Status to prevent target leakage.</w:t>
-      </w:r>
-    </w:p>
-    <w:p>
-      <w:pPr>
-        <w:pStyle w:val="Heading1"/>
-      </w:pPr>
-      <w:r>
-        <w:t>5. Model Selection and Rationale</w:t>
-      </w:r>
-    </w:p>
-    <w:p>
-      <w:pPr>
-        <w:pStyle w:val="Heading2"/>
-      </w:pPr>
-      <w:r>
-        <w:t>5.1 Linear Regression</w:t>
-      </w:r>
-    </w:p>
-    <w:p>
-      <w:r>
-        <w:t>Linear Regression is a baseline model that estimates a linear relationship between the selected input features and delivery time. It is relatively easy to explain and provides a useful reference point.</w:t>
-      </w:r>
-    </w:p>
-    <w:p>
-      <w:pPr>
-        <w:pStyle w:val="Heading2"/>
-      </w:pPr>
-      <w:r>
-        <w:t>5.2 Random Forest Regression</w:t>
-      </w:r>
-    </w:p>
-    <w:p>
-      <w:r>
-        <w:t>Random Forest combines predictions from many decision trees and can represent nonlinear relationships and interactions. The implementation uses 300 trees, a minimum leaf size of 3, and a fixed random seed for reproducibility.</w:t>
-      </w:r>
-    </w:p>
-    <w:p>
-      <w:pPr>
-        <w:pStyle w:val="Heading1"/>
-      </w:pPr>
-      <w:r>
-        <w:t>6. Evaluation Method</w:t>
-      </w:r>
-    </w:p>
-    <w:p>
-      <w:r>
-        <w:t>The models were evaluated on a held-out test set that was not used to fit the models. Five-fold cross-validation was also used to estimate how the models may perform across different train/validation splits. Metrics are:</w:t>
+        <w:t>MAE: average absolute prediction error in hours; lower is better.</w:t>
       </w:r>
     </w:p>
     <w:p>
@@ -508,7 +458,7 @@
         <w:pStyle w:val="ListBullet"/>
       </w:pPr>
       <w:r>
-        <w:t>MAE (Mean Absolute Error): average absolute prediction error in hours; lower is better.</w:t>
+        <w:t>RMSE: square root of mean squared error; it penalizes larger errors more heavily; lower is better.</w:t>
       </w:r>
     </w:p>
     <w:p>
@@ -516,7 +466,7 @@
         <w:pStyle w:val="ListBullet"/>
       </w:pPr>
       <w:r>
-        <w:t>RMSE (Root Mean Squared Error): gives greater weight to large errors; lower is better.</w:t>
+        <w:t>R²: compares predictions with a mean-target baseline; a negative test R² means the model performed worse than predicting the test-set mean for that test sample.</w:t>
       </w:r>
     </w:p>
     <w:p>
@@ -524,7 +474,7 @@
         <w:pStyle w:val="ListBullet"/>
       </w:pPr>
       <w:r>
-        <w:t>R²: compares the model with a baseline that predicts the target mean; values near zero or below zero indicate little or no useful explanatory power on the test set.</w:t>
+        <w:t>Five-fold cross-validation: used within the training set for model comparison and hyperparameter selection; the held-out test set was used for final evaluation.</w:t>
       </w:r>
     </w:p>
     <w:p>
@@ -543,16 +493,16 @@
         <w:tblLook w:firstColumn="1" w:firstRow="1" w:lastColumn="0" w:lastRow="0" w:noHBand="0" w:noVBand="1" w:val="04A0"/>
       </w:tblPr>
       <w:tblGrid>
-        <w:gridCol w:w="1987"/>
-        <w:gridCol w:w="1987"/>
-        <w:gridCol w:w="1987"/>
-        <w:gridCol w:w="1987"/>
-        <w:gridCol w:w="1987"/>
+        <w:gridCol w:w="2016"/>
+        <w:gridCol w:w="2016"/>
+        <w:gridCol w:w="2016"/>
+        <w:gridCol w:w="2016"/>
+        <w:gridCol w:w="2016"/>
       </w:tblGrid>
       <w:tr>
         <w:tc>
           <w:tcPr>
-            <w:tcW w:type="dxa" w:w="1987"/>
+            <w:tcW w:type="dxa" w:w="2016"/>
           </w:tcPr>
           <w:p>
             <w:r>
@@ -562,7 +512,7 @@
         </w:tc>
         <w:tc>
           <w:tcPr>
-            <w:tcW w:type="dxa" w:w="1987"/>
+            <w:tcW w:type="dxa" w:w="2016"/>
           </w:tcPr>
           <w:p>
             <w:r>
@@ -572,7 +522,7 @@
         </w:tc>
         <w:tc>
           <w:tcPr>
-            <w:tcW w:type="dxa" w:w="1987"/>
+            <w:tcW w:type="dxa" w:w="2016"/>
           </w:tcPr>
           <w:p>
             <w:r>
@@ -582,7 +532,7 @@
         </w:tc>
         <w:tc>
           <w:tcPr>
-            <w:tcW w:type="dxa" w:w="1987"/>
+            <w:tcW w:type="dxa" w:w="2016"/>
           </w:tcPr>
           <w:p>
             <w:r>
@@ -592,11 +542,11 @@
         </w:tc>
         <w:tc>
           <w:tcPr>
-            <w:tcW w:type="dxa" w:w="1987"/>
+            <w:tcW w:type="dxa" w:w="2016"/>
           </w:tcPr>
           <w:p>
             <w:r>
-              <w:t>5-fold CV MAE (h)</w:t>
+              <w:t>Training CV MAE (h)</w:t>
             </w:r>
           </w:p>
         </w:tc>
@@ -604,7 +554,59 @@
       <w:tr>
         <w:tc>
           <w:tcPr>
-            <w:tcW w:type="dxa" w:w="1987"/>
+            <w:tcW w:type="dxa" w:w="2016"/>
+          </w:tcPr>
+          <w:p>
+            <w:r>
+              <w:t>Mean Baseline</w:t>
+            </w:r>
+          </w:p>
+        </w:tc>
+        <w:tc>
+          <w:tcPr>
+            <w:tcW w:type="dxa" w:w="2016"/>
+          </w:tcPr>
+          <w:p>
+            <w:r>
+              <w:t>29.65</w:t>
+            </w:r>
+          </w:p>
+        </w:tc>
+        <w:tc>
+          <w:tcPr>
+            <w:tcW w:type="dxa" w:w="2016"/>
+          </w:tcPr>
+          <w:p>
+            <w:r>
+              <w:t>34.39</w:t>
+            </w:r>
+          </w:p>
+        </w:tc>
+        <w:tc>
+          <w:tcPr>
+            <w:tcW w:type="dxa" w:w="2016"/>
+          </w:tcPr>
+          <w:p>
+            <w:r>
+              <w:t>-0.003</w:t>
+            </w:r>
+          </w:p>
+        </w:tc>
+        <w:tc>
+          <w:tcPr>
+            <w:tcW w:type="dxa" w:w="2016"/>
+          </w:tcPr>
+          <w:p>
+            <w:r>
+              <w:t>29.11</w:t>
+            </w:r>
+          </w:p>
+        </w:tc>
+      </w:tr>
+      <w:tr>
+        <w:tc>
+          <w:tcPr>
+            <w:tcW w:type="dxa" w:w="2016"/>
           </w:tcPr>
           <w:p>
             <w:r>
@@ -614,7 +616,7 @@
         </w:tc>
         <w:tc>
           <w:tcPr>
-            <w:tcW w:type="dxa" w:w="1987"/>
+            <w:tcW w:type="dxa" w:w="2016"/>
           </w:tcPr>
           <w:p>
             <w:r>
@@ -624,7 +626,7 @@
         </w:tc>
         <w:tc>
           <w:tcPr>
-            <w:tcW w:type="dxa" w:w="1987"/>
+            <w:tcW w:type="dxa" w:w="2016"/>
           </w:tcPr>
           <w:p>
             <w:r>
@@ -634,7 +636,7 @@
         </w:tc>
         <w:tc>
           <w:tcPr>
-            <w:tcW w:type="dxa" w:w="1987"/>
+            <w:tcW w:type="dxa" w:w="2016"/>
           </w:tcPr>
           <w:p>
             <w:r>
@@ -644,11 +646,11 @@
         </w:tc>
         <w:tc>
           <w:tcPr>
-            <w:tcW w:type="dxa" w:w="1987"/>
+            <w:tcW w:type="dxa" w:w="2016"/>
           </w:tcPr>
           <w:p>
             <w:r>
-              <w:t>29.21</w:t>
+              <w:t>29.23</w:t>
             </w:r>
           </w:p>
         </w:tc>
@@ -656,51 +658,51 @@
       <w:tr>
         <w:tc>
           <w:tcPr>
-            <w:tcW w:type="dxa" w:w="1987"/>
+            <w:tcW w:type="dxa" w:w="2016"/>
           </w:tcPr>
           <w:p>
             <w:r>
-              <w:t>Random Forest</w:t>
+              <w:t>Tuned Random Forest</w:t>
             </w:r>
           </w:p>
         </w:tc>
         <w:tc>
           <w:tcPr>
-            <w:tcW w:type="dxa" w:w="1987"/>
+            <w:tcW w:type="dxa" w:w="2016"/>
           </w:tcPr>
           <w:p>
             <w:r>
-              <w:t>29.90</w:t>
+              <w:t>29.85</w:t>
             </w:r>
           </w:p>
         </w:tc>
         <w:tc>
           <w:tcPr>
-            <w:tcW w:type="dxa" w:w="1987"/>
+            <w:tcW w:type="dxa" w:w="2016"/>
           </w:tcPr>
           <w:p>
             <w:r>
-              <w:t>35.80</w:t>
+              <w:t>35.71</w:t>
             </w:r>
           </w:p>
         </w:tc>
         <w:tc>
           <w:tcPr>
-            <w:tcW w:type="dxa" w:w="1987"/>
+            <w:tcW w:type="dxa" w:w="2016"/>
           </w:tcPr>
           <w:p>
             <w:r>
-              <w:t>-0.086</w:t>
+              <w:t>-0.081</w:t>
             </w:r>
           </w:p>
         </w:tc>
         <w:tc>
           <w:tcPr>
-            <w:tcW w:type="dxa" w:w="1987"/>
+            <w:tcW w:type="dxa" w:w="2016"/>
           </w:tcPr>
           <w:p>
             <w:r>
-              <w:t>29.40</w:t>
+              <w:t>29.06</w:t>
             </w:r>
           </w:p>
         </w:tc>
@@ -708,8 +710,16 @@
     </w:tbl>
     <w:p>
       <w:r>
-        <w:t>On this split, Linear Regression had the lowest test MAE (29.70 hours). The test R² values are near or below zero, so neither model demonstrates strong predictive value. The model with the lowest MAE is the better of these two candidates on this split, but it should not be considered ready for production.</w:t>
+        <w:t>Model selection should rely on cross-validation within the training data, not on the held-out test set. The tuned Random Forest had the lowest training cross-validation MAE (29.06 hours), so its test metrics provide the final check of generalization. On the test set, the mean baseline had lower MAE than the tuned Random Forest. This is evidence that the tuned model did not generalize better on this split. The scores are weak overall, so none of the models should be used for operational decisions without improved data and further validation.</w:t>
       </w:r>
+    </w:p>
+    <w:p>
+      <w:r>
+        <w:t>Random Forest best parameters from training-only cross-validation: {'model__max_depth': None, 'model__max_features': 1.0, 'model__min_samples_leaf': 4, 'model__n_estimators': 300}</w:t>
+      </w:r>
+    </w:p>
+    <w:p>
+      <w:r/>
     </w:p>
     <w:p>
       <w:pPr>
@@ -718,7 +728,7 @@
       <w:r>
         <w:drawing>
           <wp:inline xmlns:a="http://schemas.openxmlformats.org/drawingml/2006/main" xmlns:pic="http://schemas.openxmlformats.org/drawingml/2006/picture">
-            <wp:extent cx="5303520" cy="3830320"/>
+            <wp:extent cx="5303520" cy="3781398"/>
             <wp:docPr id="1" name="Picture 1"/>
             <wp:cNvGraphicFramePr>
               <a:graphicFrameLocks noChangeAspect="1"/>
@@ -739,7 +749,7 @@
                   <pic:spPr>
                     <a:xfrm>
                       <a:off x="0" y="0"/>
-                      <a:ext cx="5303520" cy="3830320"/>
+                      <a:ext cx="5303520" cy="3781398"/>
                     </a:xfrm>
                     <a:prstGeom prst="rect"/>
                   </pic:spPr>
@@ -752,7 +762,7 @@
     </w:p>
     <w:p>
       <w:r>
-        <w:t>Figure 1. Actual versus predicted delivery time. Points close to the diagonal represent more accurate predictions.</w:t>
+        <w:t>Figure 1. Actual versus predicted delivery time for each model on the held-out test set.</w:t>
       </w:r>
     </w:p>
     <w:p>
@@ -762,7 +772,7 @@
       <w:r>
         <w:drawing>
           <wp:inline xmlns:a="http://schemas.openxmlformats.org/drawingml/2006/main" xmlns:pic="http://schemas.openxmlformats.org/drawingml/2006/picture">
-            <wp:extent cx="5303520" cy="3830320"/>
+            <wp:extent cx="5303520" cy="3781398"/>
             <wp:docPr id="2" name="Picture 2"/>
             <wp:cNvGraphicFramePr>
               <a:graphicFrameLocks noChangeAspect="1"/>
@@ -783,7 +793,7 @@
                   <pic:spPr>
                     <a:xfrm>
                       <a:off x="0" y="0"/>
-                      <a:ext cx="5303520" cy="3830320"/>
+                      <a:ext cx="5303520" cy="3781398"/>
                     </a:xfrm>
                     <a:prstGeom prst="rect"/>
                   </pic:spPr>
@@ -796,7 +806,7 @@
     </w:p>
     <w:p>
       <w:r>
-        <w:t>Figure 2. Residual analysis. Residuals should be randomly distributed around zero; patterns can indicate model limitations.</w:t>
+        <w:t>Figure 2. Residual plot for the model with the lowest test MAE. Residuals around zero without a clear pattern are desirable.</w:t>
       </w:r>
     </w:p>
     <w:p>
@@ -806,7 +816,7 @@
       <w:r>
         <w:drawing>
           <wp:inline xmlns:a="http://schemas.openxmlformats.org/drawingml/2006/main" xmlns:pic="http://schemas.openxmlformats.org/drawingml/2006/picture">
-            <wp:extent cx="5303520" cy="3830320"/>
+            <wp:extent cx="5303520" cy="3548130"/>
             <wp:docPr id="3" name="Picture 3"/>
             <wp:cNvGraphicFramePr>
               <a:graphicFrameLocks noChangeAspect="1"/>
@@ -827,7 +837,7 @@
                   <pic:spPr>
                     <a:xfrm>
                       <a:off x="0" y="0"/>
-                      <a:ext cx="5303520" cy="3830320"/>
+                      <a:ext cx="5303520" cy="3548130"/>
                     </a:xfrm>
                     <a:prstGeom prst="rect"/>
                   </pic:spPr>
@@ -840,7 +850,7 @@
     </w:p>
     <w:p>
       <w:r>
-        <w:t>Figure 3. Test-set MAE and RMSE comparison; lower values are preferred.</w:t>
+        <w:t>Figure 3. Test-set MAE and RMSE comparison. Lower errors are preferred.</w:t>
       </w:r>
     </w:p>
     <w:p>
@@ -850,7 +860,7 @@
       <w:r>
         <w:drawing>
           <wp:inline xmlns:a="http://schemas.openxmlformats.org/drawingml/2006/main" xmlns:pic="http://schemas.openxmlformats.org/drawingml/2006/picture">
-            <wp:extent cx="5303520" cy="3830320"/>
+            <wp:extent cx="5303520" cy="3784241"/>
             <wp:docPr id="4" name="Picture 4"/>
             <wp:cNvGraphicFramePr>
               <a:graphicFrameLocks noChangeAspect="1"/>
@@ -871,7 +881,7 @@
                   <pic:spPr>
                     <a:xfrm>
                       <a:off x="0" y="0"/>
-                      <a:ext cx="5303520" cy="3830320"/>
+                      <a:ext cx="5303520" cy="3784241"/>
                     </a:xfrm>
                     <a:prstGeom prst="rect"/>
                   </pic:spPr>
@@ -884,7 +894,7 @@
     </w:p>
     <w:p>
       <w:r>
-        <w:t>Figure 4. Random Forest feature importance. This indicates model reliance, not causation.</w:t>
+        <w:t>Figure 4. Tuned Random Forest feature importance. Importance describes model use, not causal effect.</w:t>
       </w:r>
     </w:p>
     <w:p>
@@ -892,17 +902,54 @@
         <w:pStyle w:val="Heading1"/>
       </w:pPr>
       <w:r>
-        <w:t>8. Interpretation and Limitations</w:t>
+        <w:t>8. Data Relationships and Limitations</w:t>
       </w:r>
     </w:p>
     <w:p>
       <w:r>
-        <w:t>The weak test R² results indicate that the chosen features do not explain delivery-time differences sufficiently in this dataset. This may reflect the simulated nature of the data, limited sample size, missing operational variables, or weak relationships between the available predictors and the target. The results should not be overstated. Feature importance and correlations describe patterns in the data and do not establish causal relationships.</w:t>
+        <w:t>Pearson correlations between numerical inputs and delivery time in this dataset are:</w:t>
+      </w:r>
+    </w:p>
+    <w:p>
+      <w:pPr>
+        <w:pStyle w:val="ListBullet"/>
+      </w:pPr>
+      <w:r>
+        <w:t>Transportation_Cost: 0.099</w:t>
+      </w:r>
+    </w:p>
+    <w:p>
+      <w:pPr>
+        <w:pStyle w:val="ListBullet"/>
+      </w:pPr>
+      <w:r>
+        <w:t>Distance_km: 0.075</w:t>
+      </w:r>
+    </w:p>
+    <w:p>
+      <w:pPr>
+        <w:pStyle w:val="ListBullet"/>
+      </w:pPr>
+      <w:r>
+        <w:t>Shipment_Volume: 0.047</w:t>
+      </w:r>
+    </w:p>
+    <w:p>
+      <w:pPr>
+        <w:pStyle w:val="ListBullet"/>
+      </w:pPr>
+      <w:r>
+        <w:t>Shipment_Weight_kg: -0.013</w:t>
       </w:r>
     </w:p>
     <w:p>
       <w:r>
-        <w:t>Potential additional predictors include origin and destination, route distance measured by road network, traffic conditions, weather, dispatch time, day of week, warehouse processing duration, carrier, number of stops, service level, and historical route performance. These features should be collected where appropriate, checked for quality, and made available at the time a prediction is required.</w:t>
+        <w:t>These correlations are close to zero, indicating little linear association in this simulated sample. This helps explain why a simple linear model may struggle, though correlation alone cannot rule out nonlinear patterns. The dataset is small and simulated, and may not reflect real shipment processes. Weak performance is an important result and should be reported honestly rather than hidden.</w:t>
+      </w:r>
+    </w:p>
+    <w:p>
+      <w:r>
+        <w:t>Potential additional features include origin/destination, road-network distance, dispatch time, day of week, traffic, weather, carrier, number of stops, warehouse processing time, service level, and failed delivery attempts. Only features available at the time of prediction should be used.</w:t>
       </w:r>
     </w:p>
     <w:p>
@@ -910,7 +957,7 @@
         <w:pStyle w:val="Heading1"/>
       </w:pPr>
       <w:r>
-        <w:t>9. Optimization Strategies</w:t>
+        <w:t>9. Optimization Recommendations</w:t>
       </w:r>
     </w:p>
     <w:p>
@@ -921,10 +968,10 @@
         <w:rPr>
           <w:b/>
         </w:rPr>
-        <w:t xml:space="preserve">Risk-based shipment monitoring: </w:t>
+        <w:t xml:space="preserve">Pilot risk-based monitoring: </w:t>
       </w:r>
       <w:r>
-        <w:t>Once a model has been validated on real historical data, flag shipments with predicted delivery time above the service threshold for human review. Do not automate penalties or customer promises based on this weak model.</w:t>
+        <w:t>After a model demonstrates acceptable validation performance on real historical data, flag shipments with high predicted duration for human review. The current weak model should not drive automatic customer promises.</w:t>
       </w:r>
     </w:p>
     <w:p>
@@ -935,10 +982,10 @@
         <w:rPr>
           <w:b/>
         </w:rPr>
-        <w:t xml:space="preserve">Route planning: </w:t>
+        <w:t xml:space="preserve">Improve route planning data: </w:t>
       </w:r>
       <w:r>
-        <w:t>Combine travel-time predictions with route distance, traffic, vehicle capacity, and delivery windows. Compare feasible routes by expected time and cost, and pilot changes on a small set of routes.</w:t>
+        <w:t>Combine road-network distance, traffic, delivery windows, vehicle capacity, and route constraints. Compare feasible routes on time and cost, then pilot changes before scaling.</w:t>
       </w:r>
     </w:p>
     <w:p>
@@ -949,10 +996,10 @@
         <w:rPr>
           <w:b/>
         </w:rPr>
-        <w:t xml:space="preserve">Resource allocation: </w:t>
+        <w:t xml:space="preserve">Allocate staff and vehicles using measured demand: </w:t>
       </w:r>
       <w:r>
-        <w:t>Use reliable demand and arrival forecasts to schedule drivers, vehicles, and warehouse staff during peak periods. Validate staffing recommendations against observed workloads.</w:t>
+        <w:t>Use observed shipment volume and time-of-day patterns to plan drivers, vehicles, and warehouse shifts; validate impact against service levels.</w:t>
       </w:r>
     </w:p>
     <w:p>
@@ -963,10 +1010,10 @@
         <w:rPr>
           <w:b/>
         </w:rPr>
-        <w:t xml:space="preserve">Cost optimization: </w:t>
+        <w:t xml:space="preserve">Compare transport costs fairly: </w:t>
       </w:r>
       <w:r>
-        <w:t>Compare cost per shipment and cost per kilometre by transport mode while controlling for distance, shipment weight, volume, and service level. Avoid selecting the cheapest mode if it violates delivery commitments.</w:t>
+        <w:t>Compare cost per shipment and cost per kilometre by mode while accounting for distance, weight, volume, and service requirements.</w:t>
       </w:r>
     </w:p>
     <w:p>
@@ -977,10 +1024,10 @@
         <w:rPr>
           <w:b/>
         </w:rPr>
-        <w:t xml:space="preserve">Data collection and monitoring: </w:t>
+        <w:t xml:space="preserve">Create a monitoring loop: </w:t>
       </w:r>
       <w:r>
-        <w:t>Record planned and actual dispatch/arrival timestamps, route, carrier, traffic/weather conditions, failed delivery attempts, and exceptions. Monitor MAE/RMSE by route and mode and retrain only when validated performance improves.</w:t>
+        <w:t>Track actual versus predicted time, MAE/RMSE by transport mode and route, on-time rate, and cost per shipment. Retrain only when performance on a representative validation set improves.</w:t>
       </w:r>
     </w:p>
     <w:p>
@@ -988,7 +1035,7 @@
         <w:pStyle w:val="Heading1"/>
       </w:pPr>
       <w:r>
-        <w:t>10. Suggested Future Work</w:t>
+        <w:t>10. Future Work</w:t>
       </w:r>
     </w:p>
     <w:p>
@@ -996,7 +1043,7 @@
         <w:pStyle w:val="ListBullet"/>
       </w:pPr>
       <w:r>
-        <w:t>Collect a larger, real operational dataset and document how the simulated data was generated.</w:t>
+        <w:t>Collect larger, real operational data with reliable dispatch and arrival timestamps.</w:t>
       </w:r>
     </w:p>
     <w:p>
@@ -1004,7 +1051,7 @@
         <w:pStyle w:val="ListBullet"/>
       </w:pPr>
       <w:r>
-        <w:t>Check for outliers, target distribution, and data quality issues before training.</w:t>
+        <w:t>Investigate outliers and the data-generation process, and confirm target units and definitions.</w:t>
       </w:r>
     </w:p>
     <w:p>
@@ -1012,7 +1059,7 @@
         <w:pStyle w:val="ListBullet"/>
       </w:pPr>
       <w:r>
-        <w:t>Tune Random Forest hyperparameters using GridSearchCV on the training data only, then evaluate once on the untouched test set.</w:t>
+        <w:t>Evaluate using a time-based split if the purpose is to forecast future shipments.</w:t>
       </w:r>
     </w:p>
     <w:p>
@@ -1020,7 +1067,7 @@
         <w:pStyle w:val="ListBullet"/>
       </w:pPr>
       <w:r>
-        <w:t>If records are time-ordered, use a time-based split instead of random splitting to better represent forecasting future shipments.</w:t>
+        <w:t>Use feature engineering only where operationally meaningful and available at prediction time.</w:t>
       </w:r>
     </w:p>
     <w:p>
@@ -1028,15 +1075,7 @@
         <w:pStyle w:val="ListBullet"/>
       </w:pPr>
       <w:r>
-        <w:t>Compare against a simple mean/median baseline and consider a prediction interval or quantile model for uncertainty-aware planning.</w:t>
-      </w:r>
-    </w:p>
-    <w:p>
-      <w:pPr>
-        <w:pStyle w:val="ListBullet"/>
-      </w:pPr>
-      <w:r>
-        <w:t>Measure operational outcomes in a pilot, such as on-time delivery rate, cost per shipment, and late-shipment rate, before claiming savings.</w:t>
+        <w:t>Measure business outcomes in a pilot before claiming cost savings or service improvements.</w:t>
       </w:r>
     </w:p>
     <w:p>
@@ -1049,7 +1088,7 @@
     </w:p>
     <w:p>
       <w:r>
-        <w:t>This task demonstrates an end-to-end predictive modeling workflow: problem definition, dataset inspection, preprocessing, model training, cross-validation, test evaluation, visualization, and optimization recommendations. Linear Regression and Random Forest were compared using MAE, RMSE, and R². The observed performance is weak, which is an important result rather than a reason to hide the metrics. The next priority is to improve the data and validate models against real delivery operations. Only after reliable predictive performance is demonstrated should the forecasts be used to support route, staffing, or cost decisions.</w:t>
+        <w:t>This task demonstrates a complete predictive modeling workflow with preprocessing pipelines, a baseline, Linear Regression, tuned Random Forest, cross-validation, held-out evaluation, plots, and optimization recommendations. The available simulated data shows limited predictive signal, so the main practical recommendation is to improve data collection and validate models on real logistics history before using forecasts for operational decisions.</w:t>
       </w:r>
     </w:p>
     <w:p>
@@ -1057,17 +1096,17 @@
         <w:pStyle w:val="Heading1"/>
       </w:pPr>
       <w:r>
-        <w:t>Appendix A. Reproducibility</w:t>
+        <w:t>Appendix: Reproducibility</w:t>
       </w:r>
     </w:p>
     <w:p>
       <w:r>
-        <w:t>The accompanying Python script is named week4_predictive_modeling.py. Install pandas, numpy, matplotlib, and scikit-learn, place the script and logistics_dataset.csv in the same folder, and run: python week4_predictive_modeling.py. The script saves evaluation metrics and plots in a week4_outputs folder.</w:t>
+        <w:t>Place week4_predictive_modeling.py and logistics_dataset.csv in the same directory. Install pandas, numpy, matplotlib, and scikit-learn, then run `python week4_predictive_modeling.py`. The script writes metrics and plots to week4_outputs/.</w:t>
       </w:r>
     </w:p>
     <w:sectPr>
       <w:pgSz w:w="12240" w:h="15840"/>
-      <w:pgMar w:top="1008" w:right="1152" w:bottom="1008" w:left="1152" w:header="720" w:footer="720" w:gutter="0"/>
+      <w:pgMar w:top="936" w:right="1080" w:bottom="936" w:left="1080" w:header="720" w:footer="720" w:gutter="0"/>
       <w:cols w:space="720"/>
       <w:docGrid w:linePitch="360"/>
     </w:sectPr>
@@ -1791,12 +1830,11 @@
       <w:contextualSpacing/>
     </w:pPr>
     <w:rPr>
-      <w:rFonts w:asciiTheme="majorHAnsi" w:eastAsiaTheme="majorEastAsia" w:hAnsiTheme="majorHAnsi" w:cstheme="majorBidi" w:ascii="Calibri" w:hAnsi="Calibri"/>
-      <w:b/>
+      <w:rFonts w:asciiTheme="majorHAnsi" w:eastAsiaTheme="majorEastAsia" w:hAnsiTheme="majorHAnsi" w:cstheme="majorBidi"/>
       <w:color w:val="17365D" w:themeColor="text2" w:themeShade="BF"/>
       <w:spacing w:val="5"/>
       <w:kern w:val="28"/>
-      <w:sz w:val="48"/>
+      <w:sz w:val="52"/>
       <w:szCs w:val="52"/>
     </w:rPr>
   </w:style>

</xml_diff>